<commit_message>
updated readme.md with project structure and format
</commit_message>
<xml_diff>
--- a/vaakshastra/backend/database/VaakShastra_Record.docx
+++ b/vaakshastra/backend/database/VaakShastra_Record.docx
@@ -28,7 +28,89 @@
     </w:p>
     <w:p>
       <w:r>
+        <w:t>Speaker Distribution: {'JUDGE': 1, 'ADVOCATE': 2}</w:t>
+      </w:r>
+    </w:p>
+    <w:p>
+      <w:r>
         <w:t>-------------------------------------------------------</w:t>
+      </w:r>
+    </w:p>
+    <w:p>
+      <w:pPr>
+        <w:pStyle w:val="Heading1"/>
+      </w:pPr>
+      <w:r>
+        <w:t>1. Hearing Summary</w:t>
+      </w:r>
+    </w:p>
+    <w:p>
+      <w:r>
+        <w:t>Hearing Summary:</w:t>
+      </w:r>
+    </w:p>
+    <w:p>
+      <w:r>
+        <w:t>• The court was called to order by the judge.</w:t>
+      </w:r>
+    </w:p>
+    <w:p>
+      <w:r>
+        <w:t>• The case presented was a theft charge against the accused.</w:t>
+      </w:r>
+    </w:p>
+    <w:p>
+      <w:r>
+        <w:t>• The advocate, Ramesh, stated the case involved a stolen wallet.</w:t>
+      </w:r>
+    </w:p>
+    <w:p>
+      <w:r>
+        <w:t>• The accused was identified as being charged with theft.</w:t>
+      </w:r>
+    </w:p>
+    <w:p>
+      <w:r>
+        <w:t>• The judge requested the presentation of the case.</w:t>
+      </w:r>
+    </w:p>
+    <w:p>
+      <w:r>
+        <w:t>• The advocate, Ramesh, introduced himself to the court.</w:t>
+      </w:r>
+    </w:p>
+    <w:p>
+      <w:r>
+        <w:t>• The hearing proceeded with the case to be presented.</w:t>
+      </w:r>
+    </w:p>
+    <w:p>
+      <w:r>
+        <w:t>• The court is now in session to hear the case.</w:t>
+      </w:r>
+    </w:p>
+    <w:p>
+      <w:pPr>
+        <w:pStyle w:val="Heading1"/>
+      </w:pPr>
+      <w:r>
+        <w:t>2. Key Orders And Directions</w:t>
+      </w:r>
+    </w:p>
+    <w:p>
+      <w:pPr>
+        <w:pStyle w:val="ListBullet"/>
+      </w:pPr>
+      <w:r>
+        <w:t>Order, order, order. The court is now in session. Present the case.</w:t>
+      </w:r>
+    </w:p>
+    <w:p>
+      <w:pPr>
+        <w:pStyle w:val="Heading1"/>
+      </w:pPr>
+      <w:r>
+        <w:t>3. Chronological Transcript</w:t>
       </w:r>
     </w:p>
     <w:p>
@@ -60,10 +142,10 @@
       <w:r>
         <w:rPr>
           <w:b/>
-          <w:color w:val="1A56DB"/>
+          <w:color w:val="059669"/>
           <w:sz w:val="20"/>
         </w:rPr>
-        <w:t xml:space="preserve">[JUDGE - 00:00:06]  </w:t>
+        <w:t xml:space="preserve">[ADVOCATE - 00:00:06]  </w:t>
       </w:r>
       <w:r>
         <w:rPr>
@@ -107,13 +189,61 @@
     </w:p>
     <w:p/>
     <w:p>
+      <w:pPr>
+        <w:pStyle w:val="Heading1"/>
+      </w:pPr>
+      <w:r>
+        <w:t>4. Speaker-Wise Transcript</w:t>
+      </w:r>
+    </w:p>
+    <w:p>
+      <w:r>
+        <w:rPr>
+          <w:b/>
+        </w:rPr>
+        <w:t>JUDGE (1 lines)</w:t>
+      </w:r>
+    </w:p>
+    <w:p>
+      <w:pPr>
+        <w:pStyle w:val="ListBullet"/>
+      </w:pPr>
+      <w:r>
+        <w:t>[00:00:00] Order, order, order. The court is now in session. Present the case.</w:t>
+      </w:r>
+    </w:p>
+    <w:p>
+      <w:r>
+        <w:rPr>
+          <w:b/>
+        </w:rPr>
+        <w:t>ADVOCATE (2 lines)</w:t>
+      </w:r>
+    </w:p>
+    <w:p>
+      <w:pPr>
+        <w:pStyle w:val="ListBullet"/>
+      </w:pPr>
+      <w:r>
+        <w:t>[00:00:06] Your honour, today's case is about a stolen wallet. The accused standing here is charged with theft.</w:t>
+      </w:r>
+    </w:p>
+    <w:p>
+      <w:pPr>
+        <w:pStyle w:val="ListBullet"/>
+      </w:pPr>
+      <w:r>
+        <w:t>[00:00:14] Judge, what is your name? My name is Ramesh. Your honour,</w:t>
+      </w:r>
+    </w:p>
+    <w:p>
       <w:r>
         <w:t>-------------------------------------------------------</w:t>
       </w:r>
     </w:p>
     <w:p>
       <w:r>
-        <w:t>Record Hash: 8e934d2ab6e320cc</w:t>
+        <w:t>Record Hash: 81a8f65e50882902</w:t>
       </w:r>
     </w:p>
     <w:p>

</xml_diff>

<commit_message>
extended app version to run on mobile
</commit_message>
<xml_diff>
--- a/vaakshastra/backend/database/VaakShastra_Record.docx
+++ b/vaakshastra/backend/database/VaakShastra_Record.docx
@@ -13,7 +13,7 @@
     </w:p>
     <w:p>
       <w:r>
-        <w:t>Date: 26 March 2026</w:t>
+        <w:t>Date: 27 March 2026</w:t>
       </w:r>
     </w:p>
     <w:p>
@@ -23,12 +23,12 @@
     </w:p>
     <w:p>
       <w:r>
-        <w:t>Total Utterances: 7</w:t>
+        <w:t>Total Utterances: 13</w:t>
       </w:r>
     </w:p>
     <w:p>
       <w:r>
-        <w:t>Speaker Distribution: {'JUDGE': 2, 'ADVOCATE': 4, 'UNKNOWN': 1}</w:t>
+        <w:t>Speaker Distribution: {'JUDGE': 3, 'ADVOCATE': 8, 'WITNESS': 2}</w:t>
       </w:r>
     </w:p>
     <w:p>
@@ -46,47 +46,47 @@
     </w:p>
     <w:p>
       <w:r>
-        <w:t>Hearing Summary:</w:t>
+        <w:t>**Hearing Summary:**</w:t>
       </w:r>
     </w:p>
     <w:p>
       <w:r>
-        <w:t>• The court was called to order by the judge, initiating the session.</w:t>
+        <w:t>* The court proceedings began with the judge's order to start the case.</w:t>
       </w:r>
     </w:p>
     <w:p>
       <w:r>
-        <w:t>• The advocate presented the case, stating that the accused is charged with theft.</w:t>
+        <w:t>* The advocate called a witness to the stand and had them take the oath.</w:t>
       </w:r>
     </w:p>
     <w:p>
       <w:r>
-        <w:t>• The advocate inquired about the judge's name, identifying themselves as Ramesh.</w:t>
+        <w:t>* The witness testified that they were near the market on the night of the incident and saw the accused arguing with someone.</w:t>
       </w:r>
     </w:p>
     <w:p>
       <w:r>
-        <w:t>• The judge maintained order and instructed the advocate to proceed with the case.</w:t>
+        <w:t>* The witness identified the accused as the person present in the courtroom and stated that they had a fight after the argument.</w:t>
       </w:r>
     </w:p>
     <w:p>
       <w:r>
-        <w:t>• The advocate reiterated the case details, stating that the case involves a stolen wallet.</w:t>
+        <w:t>* The witness informed the police immediately after the incident.</w:t>
       </w:r>
     </w:p>
     <w:p>
       <w:r>
-        <w:t>• The advocate again inquired about the judge's name, repeating their own introduction.</w:t>
+        <w:t>* The advocate presented the case, stating that the accused is charged with theft.</w:t>
       </w:r>
     </w:p>
     <w:p>
       <w:r>
-        <w:t>• An unknown individual made an unintelligible statement in a language other than English.</w:t>
+        <w:t>* The accused's name was revealed as Ramesh.</w:t>
       </w:r>
     </w:p>
     <w:p>
       <w:r>
-        <w:t>• The judge maintained order throughout the session.</w:t>
+        <w:t>* The court is now in session, with the case to be presented.</w:t>
       </w:r>
     </w:p>
     <w:p>
@@ -102,7 +102,15 @@
         <w:pStyle w:val="ListBullet"/>
       </w:pPr>
       <w:r>
-        <w:t>Order, order, order. The court is now in session. Present the case.</w:t>
+        <w:t>Order, order, order. In the court the case will now begin. Advocate, you may proceed.</w:t>
+      </w:r>
+    </w:p>
+    <w:p>
+      <w:pPr>
+        <w:pStyle w:val="ListBullet"/>
+      </w:pPr>
+      <w:r>
+        <w:t>Witness, please come forward and take the oath. I swear to tell the truth, the whole truth and nothing but the truth.</w:t>
       </w:r>
     </w:p>
     <w:p>
@@ -142,7 +150,7 @@
         <w:rPr>
           <w:sz w:val="22"/>
         </w:rPr>
-        <w:t>Order, order, order. The court is now in session. Present the case.</w:t>
+        <w:t>Order, order, order. In the court the case will now begin. Advocate, you may proceed.</w:t>
       </w:r>
     </w:p>
     <w:p/>
@@ -153,7 +161,7 @@
           <w:color w:val="059669"/>
           <w:sz w:val="20"/>
         </w:rPr>
-        <w:t xml:space="preserve">[ADVOCATE - 00:00:06]  </w:t>
+        <w:t xml:space="preserve">[ADVOCATE - 00:00:07]  </w:t>
       </w:r>
       <w:r>
         <w:rPr>
@@ -167,7 +175,32 @@
         <w:rPr>
           <w:sz w:val="22"/>
         </w:rPr>
-        <w:t>Your honour, today's case is about a stolen wallet. The accused standing here is charged with theft.</w:t>
+        <w:t>Thank you, your honour. I would like to call the witness to the stand.</w:t>
+      </w:r>
+    </w:p>
+    <w:p/>
+    <w:p>
+      <w:r>
+        <w:rPr>
+          <w:b/>
+          <w:color w:val="1A56DB"/>
+          <w:sz w:val="20"/>
+        </w:rPr>
+        <w:t xml:space="preserve">[JUDGE - 00:00:13]  </w:t>
+      </w:r>
+      <w:r>
+        <w:rPr>
+          <w:i/>
+          <w:sz w:val="18"/>
+        </w:rPr>
+        <w:t>(PROCEDURAL)</w:t>
+        <w:br/>
+      </w:r>
+      <w:r>
+        <w:rPr>
+          <w:sz w:val="22"/>
+        </w:rPr>
+        <w:t>Witness, please come forward and take the oath. I swear to tell the truth, the whole truth and nothing but the truth.</w:t>
       </w:r>
     </w:p>
     <w:p/>
@@ -178,7 +211,7 @@
           <w:color w:val="059669"/>
           <w:sz w:val="20"/>
         </w:rPr>
-        <w:t xml:space="preserve">[ADVOCATE - 00:00:14]  </w:t>
+        <w:t xml:space="preserve">[ADVOCATE - 00:00:22]  </w:t>
       </w:r>
       <w:r>
         <w:rPr>
@@ -192,7 +225,157 @@
         <w:rPr>
           <w:sz w:val="22"/>
         </w:rPr>
-        <w:t>Judge, what is your name? My name is Ramesh. Your honour,</w:t>
+        <w:t>the truth. You may begin questioning. Where were you on the night of that incident? I</w:t>
+      </w:r>
+    </w:p>
+    <w:p/>
+    <w:p>
+      <w:r>
+        <w:rPr>
+          <w:b/>
+          <w:color w:val="D97706"/>
+          <w:sz w:val="20"/>
+        </w:rPr>
+        <w:t xml:space="preserve">[WITNESS - 00:00:30]  </w:t>
+      </w:r>
+      <w:r>
+        <w:rPr>
+          <w:i/>
+          <w:sz w:val="18"/>
+        </w:rPr>
+        <w:t>(TESTIMONY)</w:t>
+        <w:br/>
+      </w:r>
+      <w:r>
+        <w:rPr>
+          <w:sz w:val="22"/>
+        </w:rPr>
+        <w:t>was near the market around 8 pm. Did you see the accused at that time? Yes, I saw the accused</w:t>
+      </w:r>
+    </w:p>
+    <w:p/>
+    <w:p>
+      <w:r>
+        <w:rPr>
+          <w:b/>
+          <w:color w:val="059669"/>
+          <w:sz w:val="20"/>
+        </w:rPr>
+        <w:t xml:space="preserve">[ADVOCATE - 00:00:37]  </w:t>
+      </w:r>
+      <w:r>
+        <w:rPr>
+          <w:i/>
+          <w:sz w:val="18"/>
+        </w:rPr>
+        <w:t>(QUESTION)</w:t>
+        <w:br/>
+      </w:r>
+      <w:r>
+        <w:rPr>
+          <w:sz w:val="22"/>
+        </w:rPr>
+        <w:t>arguing with someone. Can you clearly identify the accused? Yes, I can. He is present in</w:t>
+      </w:r>
+    </w:p>
+    <w:p/>
+    <w:p>
+      <w:r>
+        <w:rPr>
+          <w:b/>
+          <w:color w:val="059669"/>
+          <w:sz w:val="20"/>
+        </w:rPr>
+        <w:t xml:space="preserve">[ADVOCATE - 00:00:44]  </w:t>
+      </w:r>
+      <w:r>
+        <w:rPr>
+          <w:i/>
+          <w:sz w:val="18"/>
+        </w:rPr>
+        <w:t>(QUESTION)</w:t>
+        <w:br/>
+      </w:r>
+      <w:r>
+        <w:rPr>
+          <w:sz w:val="22"/>
+        </w:rPr>
+        <w:t>the courtroom. What happened after the argument? The argument became serious and I had a fight.</w:t>
+      </w:r>
+    </w:p>
+    <w:p/>
+    <w:p>
+      <w:r>
+        <w:rPr>
+          <w:b/>
+          <w:color w:val="059669"/>
+          <w:sz w:val="20"/>
+        </w:rPr>
+        <w:t xml:space="preserve">[ADVOCATE - 00:00:50]  </w:t>
+      </w:r>
+      <w:r>
+        <w:rPr>
+          <w:i/>
+          <w:sz w:val="18"/>
+        </w:rPr>
+        <w:t>(QUESTION)</w:t>
+        <w:br/>
+      </w:r>
+      <w:r>
+        <w:rPr>
+          <w:sz w:val="22"/>
+        </w:rPr>
+        <w:t>Did you inform the police?</w:t>
+      </w:r>
+    </w:p>
+    <w:p/>
+    <w:p>
+      <w:r>
+        <w:rPr>
+          <w:b/>
+          <w:color w:val="D97706"/>
+          <w:sz w:val="20"/>
+        </w:rPr>
+        <w:t xml:space="preserve">[WITNESS - 00:00:51]  </w:t>
+      </w:r>
+      <w:r>
+        <w:rPr>
+          <w:i/>
+          <w:sz w:val="18"/>
+        </w:rPr>
+        <w:t>(STATEMENT)</w:t>
+        <w:br/>
+      </w:r>
+      <w:r>
+        <w:rPr>
+          <w:sz w:val="22"/>
+        </w:rPr>
+        <w:t>Yes, I called the police immediately.</w:t>
+      </w:r>
+    </w:p>
+    <w:p/>
+    <w:p>
+      <w:r>
+        <w:rPr>
+          <w:b/>
+          <w:color w:val="059669"/>
+          <w:sz w:val="20"/>
+        </w:rPr>
+        <w:t xml:space="preserve">[ADVOCATE - 00:00:54]  </w:t>
+      </w:r>
+      <w:r>
+        <w:rPr>
+          <w:i/>
+          <w:sz w:val="18"/>
+        </w:rPr>
+        <w:t>(STATEMENT)</w:t>
+        <w:br/>
+      </w:r>
+      <w:r>
+        <w:rPr>
+          <w:sz w:val="22"/>
+        </w:rPr>
+        <w:t>No further questions, your honour.</w:t>
       </w:r>
     </w:p>
     <w:p/>
@@ -272,31 +455,6 @@
     </w:p>
     <w:p/>
     <w:p>
-      <w:r>
-        <w:rPr>
-          <w:b/>
-          <w:color w:val="6B7280"/>
-          <w:sz w:val="20"/>
-        </w:rPr>
-        <w:t xml:space="preserve">[UNKNOWN - 00:00:00]  </w:t>
-      </w:r>
-      <w:r>
-        <w:rPr>
-          <w:i/>
-          <w:sz w:val="18"/>
-        </w:rPr>
-        <w:t>(STATEMENT)</w:t>
-        <w:br/>
-      </w:r>
-      <w:r>
-        <w:rPr>
-          <w:sz w:val="22"/>
-        </w:rPr>
-        <w:t>ओडर ओडर ओडर</w:t>
-      </w:r>
-    </w:p>
-    <w:p/>
-    <w:p>
       <w:pPr>
         <w:pStyle w:val="Heading1"/>
       </w:pPr>
@@ -309,7 +467,7 @@
         <w:rPr>
           <w:b/>
         </w:rPr>
-        <w:t>JUDGE (2 lines)</w:t>
+        <w:t>JUDGE (3 lines)</w:t>
       </w:r>
     </w:p>
     <w:p>
@@ -317,7 +475,15 @@
         <w:pStyle w:val="ListBullet"/>
       </w:pPr>
       <w:r>
-        <w:t>[00:00:00] Order, order, order. The court is now in session. Present the case.</w:t>
+        <w:t>[00:00:00] Order, order, order. In the court the case will now begin. Advocate, you may proceed.</w:t>
+      </w:r>
+    </w:p>
+    <w:p>
+      <w:pPr>
+        <w:pStyle w:val="ListBullet"/>
+      </w:pPr>
+      <w:r>
+        <w:t>[00:00:13] Witness, please come forward and take the oath. I swear to tell the truth, the whole truth and nothing but the truth.</w:t>
       </w:r>
     </w:p>
     <w:p>
@@ -333,7 +499,7 @@
         <w:rPr>
           <w:b/>
         </w:rPr>
-        <w:t>ADVOCATE (4 lines)</w:t>
+        <w:t>ADVOCATE (8 lines)</w:t>
       </w:r>
     </w:p>
     <w:p>
@@ -341,7 +507,7 @@
         <w:pStyle w:val="ListBullet"/>
       </w:pPr>
       <w:r>
-        <w:t>[00:00:06] Your honour, today's case is about a stolen wallet. The accused standing here is charged with theft.</w:t>
+        <w:t>[00:00:07] Thank you, your honour. I would like to call the witness to the stand.</w:t>
       </w:r>
     </w:p>
     <w:p>
@@ -349,7 +515,39 @@
         <w:pStyle w:val="ListBullet"/>
       </w:pPr>
       <w:r>
-        <w:t>[00:00:14] Judge, what is your name? My name is Ramesh. Your honour,</w:t>
+        <w:t>[00:00:22] the truth. You may begin questioning. Where were you on the night of that incident? I</w:t>
+      </w:r>
+    </w:p>
+    <w:p>
+      <w:pPr>
+        <w:pStyle w:val="ListBullet"/>
+      </w:pPr>
+      <w:r>
+        <w:t>[00:00:37] arguing with someone. Can you clearly identify the accused? Yes, I can. He is present in</w:t>
+      </w:r>
+    </w:p>
+    <w:p>
+      <w:pPr>
+        <w:pStyle w:val="ListBullet"/>
+      </w:pPr>
+      <w:r>
+        <w:t>[00:00:44] the courtroom. What happened after the argument? The argument became serious and I had a fight.</w:t>
+      </w:r>
+    </w:p>
+    <w:p>
+      <w:pPr>
+        <w:pStyle w:val="ListBullet"/>
+      </w:pPr>
+      <w:r>
+        <w:t>[00:00:50] Did you inform the police?</w:t>
+      </w:r>
+    </w:p>
+    <w:p>
+      <w:pPr>
+        <w:pStyle w:val="ListBullet"/>
+      </w:pPr>
+      <w:r>
+        <w:t>[00:00:54] No further questions, your honour.</w:t>
       </w:r>
     </w:p>
     <w:p>
@@ -373,7 +571,7 @@
         <w:rPr>
           <w:b/>
         </w:rPr>
-        <w:t>UNKNOWN (1 lines)</w:t>
+        <w:t>WITNESS (2 lines)</w:t>
       </w:r>
     </w:p>
     <w:p>
@@ -381,7 +579,15 @@
         <w:pStyle w:val="ListBullet"/>
       </w:pPr>
       <w:r>
-        <w:t>[00:00:00] ओडर ओडर ओडर</w:t>
+        <w:t>[00:00:30] was near the market around 8 pm. Did you see the accused at that time? Yes, I saw the accused</w:t>
+      </w:r>
+    </w:p>
+    <w:p>
+      <w:pPr>
+        <w:pStyle w:val="ListBullet"/>
+      </w:pPr>
+      <w:r>
+        <w:t>[00:00:51] Yes, I called the police immediately.</w:t>
       </w:r>
     </w:p>
     <w:p>
@@ -391,7 +597,7 @@
     </w:p>
     <w:p>
       <w:r>
-        <w:t>Record Hash: 119d543a9a42ecd8</w:t>
+        <w:t>Record Hash: c97031697a0becfe</w:t>
       </w:r>
     </w:p>
     <w:p>

</xml_diff>